<commit_message>
Modificada prop de tutoria
</commit_message>
<xml_diff>
--- a/Propuesta de Tutoria - TechFlow.docx
+++ b/Propuesta de Tutoria - TechFlow.docx
@@ -5,7 +5,7 @@
     <w:p>
       <w:pPr>
         <w:spacing w:after="120" w:lineRule="auto"/>
-        <w:jc w:val="both"/>
+        <w:jc w:val="center"/>
         <w:rPr/>
       </w:pPr>
       <w:r>
@@ -14,7 +14,7 @@
           <wp:inline distB="0" distT="0" distL="0" distR="0">
             <wp:extent cx="1051560" cy="672998"/>
             <wp:effectExtent b="0" l="0" r="0" t="0"/>
-            <wp:docPr id="2" name="image1.png"/>
+            <wp:docPr id="3" name="image1.png"/>
             <a:graphic>
               <a:graphicData uri="http://schemas.openxmlformats.org/drawingml/2006/picture">
                 <pic:pic>
@@ -52,7 +52,7 @@
     <w:p>
       <w:pPr>
         <w:spacing w:after="40" w:lineRule="auto"/>
-        <w:jc w:val="both"/>
+        <w:jc w:val="center"/>
         <w:rPr/>
       </w:pPr>
       <w:r>
@@ -73,7 +73,7 @@
     <w:p>
       <w:pPr>
         <w:spacing w:after="360" w:lineRule="auto"/>
-        <w:jc w:val="both"/>
+        <w:jc w:val="center"/>
         <w:rPr/>
       </w:pPr>
       <w:r>
@@ -93,18 +93,9 @@
     </w:p>
     <w:p>
       <w:pPr>
-        <w:pStyle w:val="Title"/>
-        <w:spacing w:after="120" w:lineRule="auto"/>
-        <w:jc w:val="both"/>
+        <w:jc w:val="center"/>
         <w:rPr/>
       </w:pPr>
-      <w:r>
-        <w:rPr>
-          <w:rFonts w:ascii="Arial" w:cs="Arial" w:eastAsia="Arial" w:hAnsi="Arial"/>
-          <w:rtl w:val="0"/>
-        </w:rPr>
-        <w:t xml:space="preserve">Propuesta de Tutoría: Proyecto TechFlow</w:t>
-      </w:r>
       <w:r>
         <w:rPr>
           <w:rtl w:val="0"/>
@@ -113,84 +104,6 @@
     </w:p>
     <w:p>
       <w:pPr>
-        <w:spacing w:after="440" w:lineRule="auto"/>
-        <w:jc w:val="both"/>
-        <w:rPr/>
-      </w:pPr>
-      <w:r>
-        <w:rPr>
-          <w:color w:val="5b6672"/>
-          <w:sz w:val="19"/>
-          <w:szCs w:val="19"/>
-          <w:rtl w:val="0"/>
-        </w:rPr>
-        <w:t>Equipo: Brian Gutiérrez Colque · David Gutiérrez · Federico Iacono   |   Fecha: 16 de agosto de 2026   |   Para: Oscar Londero</w:t>
-      </w:r>
-    </w:p>
-    <w:tbl>
-      <w:tblPr>
-        <w:tblStyle w:val="Table1"/>
-        <w:tblW w:w="8640.0" w:type="dxa"/>
-        <w:jc w:val="center"/>
-        <w:tblLayout w:type="fixed"/>
-        <w:tblLook w:val="0400"/>
-      </w:tblPr>
-      <w:tblGrid>
-        <w:gridCol w:w="8640"/>
-        <w:tblGridChange w:id="0">
-          <w:tblGrid>
-            <w:gridCol w:w="8640"/>
-          </w:tblGrid>
-        </w:tblGridChange>
-      </w:tblGrid>
-      <w:tr>
-        <w:trPr>
-          <w:cantSplit w:val="0"/>
-          <w:tblHeader w:val="0"/>
-        </w:trPr>
-        <w:tc>
-          <w:tcPr>
-            <w:shd w:fill="fff3cd" w:val="clear"/>
-          </w:tcPr>
-          <w:p>
-            <w:pPr>
-              <w:spacing w:after="80" w:before="80" w:lineRule="auto"/>
-              <w:jc w:val="both"/>
-              <w:rPr/>
-            </w:pPr>
-            <w:r>
-              <w:rPr>
-                <w:b w:val="1"/>
-                <w:bCs w:val="1"/>
-                <w:color w:val="6b520b"/>
-                <w:sz w:val="19"/>
-                <w:szCs w:val="19"/>
-                <w:rtl w:val="0"/>
-              </w:rPr>
-              <w:t xml:space="preserve">NOTA INTERNA PARA EL EQUIPO — no forma parte de lo que se envía a Oscar</w:t>
-              <w:br w:type="textWrapping"/>
-            </w:r>
-            <w:r>
-              <w:rPr>
-                <w:color w:val="6b520b"/>
-                <w:sz w:val="19"/>
-                <w:szCs w:val="19"/>
-                <w:rtl w:val="0"/>
-              </w:rPr>
-              <w:t xml:space="preserve">Esto es el borrador de lo que le presentaríamos a Oscar Londero para proponerle que sea nuestro tutor. Ya incorpora la investigación de campo que hizo David (los tres perfiles de negocio, los hallazgos y la conclusión de dejar la IA para el final) y no incluye nada sobre roles del equipo, siguiendo lo que David planteó en sus comentarios. Revisen si están de acuerdo con lo que dice —o si cambiarían algo— antes de que lo mandemos por la mensajería del campus. A partir de la línea de abajo, el texto ya está escrito en el tono con el que le hablaríamos directamente a él.</w:t>
-            </w:r>
-            <w:r>
-              <w:rPr>
-                <w:rtl w:val="0"/>
-              </w:rPr>
-            </w:r>
-          </w:p>
-        </w:tc>
-      </w:tr>
-    </w:tbl>
-    <w:p>
-      <w:pPr>
-        <w:spacing w:after="80" w:lineRule="auto"/>
         <w:jc w:val="both"/>
         <w:rPr/>
       </w:pPr>
@@ -202,19 +115,9 @@
     </w:p>
     <w:p>
       <w:pPr>
-        <w:spacing w:after="360" w:lineRule="auto"/>
         <w:jc w:val="both"/>
         <w:rPr/>
       </w:pPr>
-      <w:r>
-        <w:rPr>
-          <w:color w:val="5b6672"/>
-          <w:sz w:val="18"/>
-          <w:szCs w:val="18"/>
-          <w:rtl w:val="0"/>
-        </w:rPr>
-        <w:t xml:space="preserve">───  A partir de acá, texto de la propuesta  ───</w:t>
-      </w:r>
       <w:r>
         <w:rPr>
           <w:rtl w:val="0"/>
@@ -226,6 +129,30 @@
         <w:jc w:val="both"/>
         <w:rPr/>
       </w:pPr>
+      <w:r>
+        <w:rPr>
+          <w:rtl w:val="0"/>
+        </w:rPr>
+      </w:r>
+    </w:p>
+    <w:p>
+      <w:pPr>
+        <w:jc w:val="both"/>
+        <w:rPr/>
+      </w:pPr>
+      <w:r>
+        <w:rPr>
+          <w:rtl w:val="0"/>
+        </w:rPr>
+      </w:r>
+    </w:p>
+    <w:p>
+      <w:pPr>
+        <w:jc w:val="both"/>
+        <w:rPr/>
+      </w:pPr>
+      <w:bookmarkStart w:colFirst="0" w:colLast="0" w:name="_heading=h.x0y6syvutl2k" w:id="0"/>
+      <w:bookmarkEnd w:id="0"/>
       <w:r>
         <w:rPr>
           <w:rtl w:val="0"/>
@@ -242,7 +169,7 @@
         <w:rPr>
           <w:rtl w:val="0"/>
         </w:rPr>
-        <w:t>Somos Brian Gutiérrez Colque, David Gutiérrez y Federico Iacono, estudiantes de la Tecnicatura Universitaria en Programación de la UTN modalidad a distancia. Le escribimos para proponerle acompañarnos como tutor en nuestro Trabajo Final Integrador.</w:t>
+        <w:t xml:space="preserve">Somos Brian Gutiérrez Colque, David Gutiérrez y Federico Iacono, estudiantes de la Tecnicatura Universitaria en Programación de la UTN modalidad a distancia. Le proponemos acompañarnos como tutor en nuestro Trabajo Final Integrador.</w:t>
       </w:r>
     </w:p>
     <w:p>
@@ -354,15 +281,13 @@
       <w:pPr>
         <w:numPr>
           <w:ilvl w:val="0"/>
-          <w:numId w:val="3"/>
+          <w:numId w:val="1"/>
         </w:numPr>
         <w:shd w:fill="ffffff" w:val="clear"/>
-        <w:spacing w:after="200" w:before="240" w:lineRule="auto"/>
+        <w:spacing w:before="240" w:lineRule="auto"/>
         <w:ind w:left="720" w:hanging="360"/>
         <w:jc w:val="both"/>
-        <w:rPr>
-          <w:u w:val="none"/>
-        </w:rPr>
+        <w:rPr/>
       </w:pPr>
       <w:r>
         <w:rPr>
@@ -383,15 +308,12 @@
       <w:pPr>
         <w:numPr>
           <w:ilvl w:val="0"/>
-          <w:numId w:val="3"/>
+          <w:numId w:val="1"/>
         </w:numPr>
         <w:shd w:fill="ffffff" w:val="clear"/>
-        <w:spacing w:after="200" w:before="0" w:lineRule="auto"/>
         <w:ind w:left="720" w:hanging="360"/>
         <w:jc w:val="both"/>
-        <w:rPr>
-          <w:u w:val="none"/>
-        </w:rPr>
+        <w:rPr/>
       </w:pPr>
       <w:r>
         <w:rPr>
@@ -412,15 +334,12 @@
       <w:pPr>
         <w:numPr>
           <w:ilvl w:val="0"/>
-          <w:numId w:val="3"/>
+          <w:numId w:val="1"/>
         </w:numPr>
         <w:shd w:fill="ffffff" w:val="clear"/>
-        <w:spacing w:after="200" w:before="0" w:lineRule="auto"/>
         <w:ind w:left="720" w:hanging="360"/>
         <w:jc w:val="both"/>
-        <w:rPr>
-          <w:u w:val="none"/>
-        </w:rPr>
+        <w:rPr/>
       </w:pPr>
       <w:r>
         <w:rPr>
@@ -441,15 +360,13 @@
       <w:pPr>
         <w:numPr>
           <w:ilvl w:val="0"/>
-          <w:numId w:val="3"/>
+          <w:numId w:val="1"/>
         </w:numPr>
         <w:shd w:fill="ffffff" w:val="clear"/>
-        <w:spacing w:after="200" w:before="240" w:lineRule="auto"/>
+        <w:spacing w:before="240" w:lineRule="auto"/>
         <w:ind w:left="720" w:hanging="360"/>
         <w:jc w:val="both"/>
-        <w:rPr>
-          <w:u w:val="none"/>
-        </w:rPr>
+        <w:rPr/>
       </w:pPr>
       <w:r>
         <w:rPr>
@@ -465,16 +382,11 @@
         </w:rPr>
         <w:t xml:space="preserve"> Inexistencia de un control de stock unificado, lo que impide una gestión eficaz de los insumos y limita la visibilidad sobre los indicadores clave de rentabilidad.</w:t>
       </w:r>
-      <w:r>
-        <w:rPr>
-          <w:rtl w:val="0"/>
-        </w:rPr>
-      </w:r>
     </w:p>
     <w:p>
       <w:pPr>
         <w:shd w:fill="ffffff" w:val="clear"/>
-        <w:spacing w:after="200" w:before="240" w:lineRule="auto"/>
+        <w:spacing w:before="240" w:lineRule="auto"/>
         <w:ind w:left="720" w:firstLine="0"/>
         <w:jc w:val="both"/>
         <w:rPr/>
@@ -493,7 +405,7 @@
     <w:p>
       <w:pPr>
         <w:shd w:fill="ffffff" w:val="clear"/>
-        <w:spacing w:after="200" w:before="240" w:lineRule="auto"/>
+        <w:spacing w:before="240" w:lineRule="auto"/>
         <w:ind w:left="720" w:firstLine="0"/>
         <w:jc w:val="both"/>
         <w:rPr/>
@@ -513,23 +425,19 @@
         <w:rPr>
           <w:rtl w:val="0"/>
         </w:rPr>
-        <w:t>A partir de eso, el núcleo del sistema quedó definido como un circuito de Órdenes de Trabajo, Presupuestos y Stock.</w:t>
+        <w:t xml:space="preserve">A partir de eso, el núcleo del sistema quedó definido como un circuito de Órdenes de Trabajo, Presupuestos y Stock.</w:t>
       </w:r>
     </w:p>
     <w:p>
       <w:pPr>
         <w:pStyle w:val="Heading2"/>
-        <w:spacing w:before="200" w:lineRule="auto"/>
         <w:jc w:val="both"/>
-        <w:rPr>
-          <w:highlight w:val="yellow"/>
-        </w:rPr>
+        <w:rPr/>
       </w:pPr>
-      <w:bookmarkStart w:colFirst="0" w:colLast="0" w:name="_heading=h.k1jxz1kdf4tf" w:id="0"/>
-      <w:bookmarkEnd w:id="0"/>
+      <w:bookmarkStart w:colFirst="0" w:colLast="0" w:name="_heading=h.k1jxz1kdf4tf" w:id="1"/>
+      <w:bookmarkEnd w:id="1"/>
       <w:r>
         <w:rPr>
-          <w:highlight w:val="yellow"/>
           <w:rtl w:val="0"/>
         </w:rPr>
         <w:t xml:space="preserve">Arquitectura y Tecnologías:</w:t>
@@ -539,23 +447,13 @@
       <w:pPr>
         <w:spacing w:before="200" w:lineRule="auto"/>
         <w:jc w:val="both"/>
-        <w:rPr>
-          <w:highlight w:val="yellow"/>
-        </w:rPr>
+        <w:rPr/>
       </w:pPr>
       <w:r>
         <w:rPr>
-          <w:highlight w:val="yellow"/>
           <w:rtl w:val="0"/>
         </w:rPr>
-        <w:t xml:space="preserve">Proponemos diseñar e</w:t>
-      </w:r>
-      <w:r>
-        <w:rPr>
-          <w:highlight w:val="yellow"/>
-          <w:rtl w:val="0"/>
-        </w:rPr>
-        <w:t xml:space="preserve">l sistema bajo una arquitectura desacoplada para garantizar la escalabilidad y una clara separación de responsabilidades:</w:t>
+        <w:t xml:space="preserve">Proponemos diseñar el sistema bajo una arquitectura desacoplada para garantizar la escalabilidad y una clara separación de responsabilidades:</w:t>
       </w:r>
     </w:p>
     <w:p>
@@ -563,22 +461,18 @@
         <w:shd w:fill="ffffff" w:val="clear"/>
         <w:spacing w:after="240" w:before="240" w:lineRule="auto"/>
         <w:jc w:val="both"/>
-        <w:rPr>
-          <w:highlight w:val="yellow"/>
-        </w:rPr>
+        <w:rPr/>
       </w:pPr>
       <w:r>
         <w:rPr>
           <w:b w:val="1"/>
           <w:bCs w:val="1"/>
-          <w:highlight w:val="yellow"/>
           <w:rtl w:val="0"/>
         </w:rPr>
         <w:t xml:space="preserve">Frontend (React con TypeScript):</w:t>
       </w:r>
       <w:r>
         <w:rPr>
-          <w:highlight w:val="yellow"/>
           <w:rtl w:val="0"/>
         </w:rPr>
         <w:t xml:space="preserve"> Se optó por React debido a su arquitectura basada en componentes, que optimiza la reutilización y el mantenimiento. La implementación de TypeScript añade una capa de tipado estático que reduce la probabilidad de errores en tiempo de ejecución y mejora significativamente la escalabilidad del código.</w:t>
@@ -589,22 +483,18 @@
         <w:shd w:fill="ffffff" w:val="clear"/>
         <w:spacing w:after="240" w:before="240" w:lineRule="auto"/>
         <w:jc w:val="both"/>
-        <w:rPr>
-          <w:highlight w:val="yellow"/>
-        </w:rPr>
+        <w:rPr/>
       </w:pPr>
       <w:r>
         <w:rPr>
           <w:b w:val="1"/>
           <w:bCs w:val="1"/>
-          <w:highlight w:val="yellow"/>
           <w:rtl w:val="0"/>
         </w:rPr>
         <w:t xml:space="preserve">Backend (API REST con Spring Boot):</w:t>
       </w:r>
       <w:r>
         <w:rPr>
-          <w:highlight w:val="yellow"/>
           <w:rtl w:val="0"/>
         </w:rPr>
         <w:t xml:space="preserve"> Se seleccionó Spring Boot por ser un estándar en la industria para el desarrollo de servicios robustos y seguros. Su ecosistema maduro permite una gestión eficiente de la lógica de negocio y ofrece una estructura sólida para exponer servicios REST, facilitando la integración futura con otros módulos o sistemas.</w:t>
@@ -613,21 +503,13 @@
     <w:p>
       <w:pPr>
         <w:jc w:val="both"/>
-        <w:rPr>
-          <w:highlight w:val="yellow"/>
-        </w:rPr>
+        <w:rPr/>
       </w:pPr>
-      <w:r>
-        <w:rPr>
-          <w:highlight w:val="yellow"/>
-          <w:rtl w:val="0"/>
-        </w:rPr>
-        <w:t xml:space="preserve">Todavía estamos cerrando el motor de persistencia.</w:t>
-      </w:r>
       <w:r>
         <w:rPr>
           <w:rtl w:val="0"/>
         </w:rPr>
+        <w:t xml:space="preserve">Todavía estamos cerrando el motor de persistencia.</w:t>
       </w:r>
     </w:p>
     <w:p>
@@ -658,7 +540,7 @@
     </w:p>
     <w:tbl>
       <w:tblPr>
-        <w:tblStyle w:val="Table2"/>
+        <w:tblStyle w:val="Table1"/>
         <w:tblW w:w="8640.0" w:type="dxa"/>
         <w:jc w:val="left"/>
         <w:tblInd w:w="-108.0" w:type="dxa"/>
@@ -1080,18 +962,14 @@
         <w:rPr>
           <w:rtl w:val="0"/>
         </w:rPr>
-        <w:t>Para que su tutoría sea estructurada y efectiva desde el inicio, proponemos los siguientes ejes de trabajo:</w:t>
+        <w:t xml:space="preserve">Para que su tutoría sea estructurada y efectiva desde el inicio, proponemos los siguientes ejes de trabajo:</w:t>
       </w:r>
     </w:p>
     <w:p>
       <w:pPr>
-        <w:keepNext w:val="0"/>
-        <w:keepLines w:val="0"/>
-        <w:pageBreakBefore w:val="0"/>
-        <w:widowControl w:val="1"/>
         <w:numPr>
           <w:ilvl w:val="0"/>
-          <w:numId w:val="5"/>
+          <w:numId w:val="2"/>
         </w:numPr>
         <w:pBdr>
           <w:top w:space="0" w:sz="0" w:val="nil"/>
@@ -1100,41 +978,31 @@
           <w:right w:space="0" w:sz="0" w:val="nil"/>
           <w:between w:space="0" w:sz="0" w:val="nil"/>
         </w:pBdr>
-        <w:shd w:fill="auto" w:val="clear"/>
-        <w:spacing w:after="0" w:before="0" w:line="276" w:lineRule="auto"/>
-        <w:ind w:left="360" w:right="0" w:hanging="360"/>
+        <w:spacing w:after="0" w:lineRule="auto"/>
+        <w:ind w:left="360" w:hanging="360"/>
         <w:jc w:val="both"/>
         <w:rPr/>
       </w:pPr>
       <w:r>
         <w:rPr>
-          <w:rFonts w:ascii="Arial" w:cs="Arial" w:eastAsia="Arial" w:hAnsi="Arial"/>
-          <w:b/>
-          <w:bCs w:val="0"/>
-          <w:i w:val="0"/>
-          <w:iCs w:val="0"/>
-          <w:smallCaps w:val="0"/>
-          <w:strike w:val="0"/>
-          <w:color w:val="1f1f1f"/>
-          <w:sz w:val="22"/>
-          <w:szCs w:val="22"/>
-          <w:u w:val="none"/>
-          <w:shd w:fill="auto" w:val="clear"/>
-          <w:vertAlign w:val="baseline"/>
+          <w:b w:val="1"/>
+          <w:bCs w:val="1"/>
           <w:rtl w:val="0"/>
         </w:rPr>
-        <w:t>Definición de la arquitectura de persistencia: Requerimos su orientación técnica para definir el modelo de datos y seleccionar la estrategia de persistencia óptima para el core del sistema (órdenes de trabajo, presupuestos y gestión de stock). Hoy dudamos entre Firebase o Supabase como servicio gestionado, y buscamos consolidar esta decisión antes de nuestra 2.ª entrega (27/09).</w:t>
+        <w:t xml:space="preserve">Definición de la arquitectura de persistencia:</w:t>
+      </w:r>
+      <w:r>
+        <w:rPr>
+          <w:rtl w:val="0"/>
+        </w:rPr>
+        <w:t xml:space="preserve"> Requerimos su orientación técnica para definir el modelo de datos y seleccionar la estrategia de persistencia óptima para el core del sistema (órdenes de trabajo, presupuestos y gestión de stock). Buscamos evaluar la integración entre un esquema de PostgreSQL tradicional frente a servicios gestionados como Supabase o Firebase, consolidando esta decisión antes de nuestra 2.ª entrega (27/09).</w:t>
       </w:r>
     </w:p>
     <w:p>
       <w:pPr>
-        <w:keepNext w:val="0"/>
-        <w:keepLines w:val="0"/>
-        <w:pageBreakBefore w:val="0"/>
-        <w:widowControl w:val="1"/>
         <w:numPr>
           <w:ilvl w:val="0"/>
-          <w:numId w:val="5"/>
+          <w:numId w:val="2"/>
         </w:numPr>
         <w:pBdr>
           <w:top w:space="0" w:sz="0" w:val="nil"/>
@@ -1143,33 +1011,22 @@
           <w:right w:space="0" w:sz="0" w:val="nil"/>
           <w:between w:space="0" w:sz="0" w:val="nil"/>
         </w:pBdr>
-        <w:shd w:fill="auto" w:val="clear"/>
-        <w:spacing w:after="200" w:before="0" w:line="276" w:lineRule="auto"/>
-        <w:ind w:left="360" w:right="0" w:hanging="360"/>
+        <w:ind w:left="360" w:hanging="360"/>
         <w:jc w:val="both"/>
         <w:rPr/>
       </w:pPr>
       <w:r>
         <w:rPr>
-          <w:rFonts w:ascii="Arial" w:cs="Arial" w:eastAsia="Arial" w:hAnsi="Arial"/>
-          <w:b/>
-          <w:bCs w:val="0"/>
-          <w:i w:val="0"/>
-          <w:iCs w:val="0"/>
-          <w:smallCaps w:val="0"/>
-          <w:strike w:val="0"/>
-          <w:color w:val="1f1f1f"/>
-          <w:sz w:val="22"/>
-          <w:szCs w:val="22"/>
-          <w:u w:val="none"/>
-          <w:shd w:fill="auto" w:val="clear"/>
-          <w:vertAlign w:val="baseline"/>
+          <w:b w:val="1"/>
+          <w:bCs w:val="1"/>
           <w:rtl w:val="0"/>
         </w:rPr>
-        <w:t>Roadmap de innovación (IA/RAG):</w:t>
+        <w:t xml:space="preserve">Roadmap de innovación (IA/RAG):</w:t>
       </w:r>
       <w:r>
-        <w:rPr/>
+        <w:rPr>
+          <w:rtl w:val="0"/>
+        </w:rPr>
         <w:t xml:space="preserve"> Una vez estabilizado el núcleo operativo y contando con un volumen de datos reales, nos gustaría contar con su guía para la implementación de un asistente inteligente basado en técnicas RAG. Consideramos fundamental posponer esta fase para asegurar primero la robustez del sistema, alineándonos con los hallazgos de nuestra investigación de campo.</w:t>
       </w:r>
     </w:p>
@@ -1210,11 +1067,6 @@
         </w:rPr>
         <w:t xml:space="preserve">Estamos convencidos de que su perfil y experiencia son la pieza clave para elevar el nivel técnico y académico de nuestro TFI. Contar con su mentoría nos permitiría asegurar la solidez arquitectónica y la viabilidad del proyecto, garantizando que alcancemos los estándares de calidad que nos hemos propuesto.</w:t>
       </w:r>
-      <w:r>
-        <w:rPr>
-          <w:rtl w:val="0"/>
-        </w:rPr>
-      </w:r>
     </w:p>
     <w:p>
       <w:pPr>
@@ -1239,13 +1091,7 @@
         <w:rPr>
           <w:rtl w:val="0"/>
         </w:rPr>
-        <w:t xml:space="preserve">Quedamos a la espera de sus noticias por la mensajería del campus para definir el mejor momento para este encuentro.</w:t>
-      </w:r>
-      <w:r>
-        <w:rPr>
-          <w:rtl w:val="0"/>
-        </w:rPr>
-        <w:t xml:space="preserve"> </w:t>
+        <w:t xml:space="preserve">Quedamos a la espera de sus noticias por la mensajería del campus para definir el mejor momento para este encuentro. </w:t>
       </w:r>
     </w:p>
     <w:p>
@@ -1284,7 +1130,7 @@
         <w:rPr>
           <w:rtl w:val="0"/>
         </w:rPr>
-        <w:t>David Gutiérrez</w:t>
+        <w:t xml:space="preserve">David Gutiérrez</w:t>
       </w:r>
     </w:p>
     <w:p>
@@ -1297,7 +1143,7 @@
         <w:rPr>
           <w:rtl w:val="0"/>
         </w:rPr>
-        <w:t>Federico Iacono</w:t>
+        <w:t xml:space="preserve">Federico Iacono</w:t>
       </w:r>
     </w:p>
     <w:sectPr>
@@ -1422,345 +1268,6 @@
     </w:lvl>
   </w:abstractNum>
   <w:abstractNum w:abstractNumId="2">
-    <w:lvl w:ilvl="0">
-      <w:start w:val="1"/>
-      <w:numFmt w:val="bullet"/>
-      <w:lvlText w:val="●"/>
-      <w:lvlJc w:val="left"/>
-      <w:pPr>
-        <w:ind w:left="720" w:hanging="360"/>
-      </w:pPr>
-      <w:rPr>
-        <w:rFonts w:ascii="Google Sans" w:cs="Google Sans" w:eastAsia="Google Sans" w:hAnsi="Google Sans"/>
-        <w:b w:val="0"/>
-        <w:bCs w:val="0"/>
-        <w:i w:val="0"/>
-        <w:iCs w:val="0"/>
-        <w:smallCaps w:val="0"/>
-        <w:color w:val="1f1f1f"/>
-        <w:sz w:val="21"/>
-        <w:szCs w:val="21"/>
-        <w:u w:val="none"/>
-      </w:rPr>
-    </w:lvl>
-    <w:lvl w:ilvl="1">
-      <w:start w:val="1"/>
-      <w:numFmt w:val="bullet"/>
-      <w:lvlText w:val="○"/>
-      <w:lvlJc w:val="left"/>
-      <w:pPr>
-        <w:ind w:left="1440" w:hanging="360"/>
-      </w:pPr>
-      <w:rPr>
-        <w:u w:val="none"/>
-      </w:rPr>
-    </w:lvl>
-    <w:lvl w:ilvl="2">
-      <w:start w:val="1"/>
-      <w:numFmt w:val="bullet"/>
-      <w:lvlText w:val="■"/>
-      <w:lvlJc w:val="left"/>
-      <w:pPr>
-        <w:ind w:left="2160" w:hanging="360"/>
-      </w:pPr>
-      <w:rPr>
-        <w:u w:val="none"/>
-      </w:rPr>
-    </w:lvl>
-    <w:lvl w:ilvl="3">
-      <w:start w:val="1"/>
-      <w:numFmt w:val="bullet"/>
-      <w:lvlText w:val="●"/>
-      <w:lvlJc w:val="left"/>
-      <w:pPr>
-        <w:ind w:left="2880" w:hanging="360"/>
-      </w:pPr>
-      <w:rPr>
-        <w:u w:val="none"/>
-      </w:rPr>
-    </w:lvl>
-    <w:lvl w:ilvl="4">
-      <w:start w:val="1"/>
-      <w:numFmt w:val="bullet"/>
-      <w:lvlText w:val="○"/>
-      <w:lvlJc w:val="left"/>
-      <w:pPr>
-        <w:ind w:left="3600" w:hanging="360"/>
-      </w:pPr>
-      <w:rPr>
-        <w:u w:val="none"/>
-      </w:rPr>
-    </w:lvl>
-    <w:lvl w:ilvl="5">
-      <w:start w:val="1"/>
-      <w:numFmt w:val="bullet"/>
-      <w:lvlText w:val="■"/>
-      <w:lvlJc w:val="left"/>
-      <w:pPr>
-        <w:ind w:left="4320" w:hanging="360"/>
-      </w:pPr>
-      <w:rPr>
-        <w:u w:val="none"/>
-      </w:rPr>
-    </w:lvl>
-    <w:lvl w:ilvl="6">
-      <w:start w:val="1"/>
-      <w:numFmt w:val="bullet"/>
-      <w:lvlText w:val="●"/>
-      <w:lvlJc w:val="left"/>
-      <w:pPr>
-        <w:ind w:left="5040" w:hanging="360"/>
-      </w:pPr>
-      <w:rPr>
-        <w:u w:val="none"/>
-      </w:rPr>
-    </w:lvl>
-    <w:lvl w:ilvl="7">
-      <w:start w:val="1"/>
-      <w:numFmt w:val="bullet"/>
-      <w:lvlText w:val="○"/>
-      <w:lvlJc w:val="left"/>
-      <w:pPr>
-        <w:ind w:left="5760" w:hanging="360"/>
-      </w:pPr>
-      <w:rPr>
-        <w:u w:val="none"/>
-      </w:rPr>
-    </w:lvl>
-    <w:lvl w:ilvl="8">
-      <w:start w:val="1"/>
-      <w:numFmt w:val="bullet"/>
-      <w:lvlText w:val="■"/>
-      <w:lvlJc w:val="left"/>
-      <w:pPr>
-        <w:ind w:left="6480" w:hanging="360"/>
-      </w:pPr>
-      <w:rPr>
-        <w:u w:val="none"/>
-      </w:rPr>
-    </w:lvl>
-  </w:abstractNum>
-  <w:abstractNum w:abstractNumId="3">
-    <w:lvl w:ilvl="0">
-      <w:start w:val="1"/>
-      <w:numFmt w:val="decimal"/>
-      <w:lvlText w:val="%1."/>
-      <w:lvlJc w:val="left"/>
-      <w:pPr>
-        <w:ind w:left="720" w:hanging="360"/>
-      </w:pPr>
-      <w:rPr>
-        <w:u w:val="none"/>
-      </w:rPr>
-    </w:lvl>
-    <w:lvl w:ilvl="1">
-      <w:start w:val="1"/>
-      <w:numFmt w:val="lowerLetter"/>
-      <w:lvlText w:val="%2."/>
-      <w:lvlJc w:val="left"/>
-      <w:pPr>
-        <w:ind w:left="1440" w:hanging="360"/>
-      </w:pPr>
-      <w:rPr>
-        <w:u w:val="none"/>
-      </w:rPr>
-    </w:lvl>
-    <w:lvl w:ilvl="2">
-      <w:start w:val="1"/>
-      <w:numFmt w:val="lowerRoman"/>
-      <w:lvlText w:val="%3."/>
-      <w:lvlJc w:val="right"/>
-      <w:pPr>
-        <w:ind w:left="2160" w:hanging="360"/>
-      </w:pPr>
-      <w:rPr>
-        <w:u w:val="none"/>
-      </w:rPr>
-    </w:lvl>
-    <w:lvl w:ilvl="3">
-      <w:start w:val="1"/>
-      <w:numFmt w:val="decimal"/>
-      <w:lvlText w:val="%4."/>
-      <w:lvlJc w:val="left"/>
-      <w:pPr>
-        <w:ind w:left="2880" w:hanging="360"/>
-      </w:pPr>
-      <w:rPr>
-        <w:u w:val="none"/>
-      </w:rPr>
-    </w:lvl>
-    <w:lvl w:ilvl="4">
-      <w:start w:val="1"/>
-      <w:numFmt w:val="lowerLetter"/>
-      <w:lvlText w:val="%5."/>
-      <w:lvlJc w:val="left"/>
-      <w:pPr>
-        <w:ind w:left="3600" w:hanging="360"/>
-      </w:pPr>
-      <w:rPr>
-        <w:u w:val="none"/>
-      </w:rPr>
-    </w:lvl>
-    <w:lvl w:ilvl="5">
-      <w:start w:val="1"/>
-      <w:numFmt w:val="lowerRoman"/>
-      <w:lvlText w:val="%6."/>
-      <w:lvlJc w:val="right"/>
-      <w:pPr>
-        <w:ind w:left="4320" w:hanging="360"/>
-      </w:pPr>
-      <w:rPr>
-        <w:u w:val="none"/>
-      </w:rPr>
-    </w:lvl>
-    <w:lvl w:ilvl="6">
-      <w:start w:val="1"/>
-      <w:numFmt w:val="decimal"/>
-      <w:lvlText w:val="%7."/>
-      <w:lvlJc w:val="left"/>
-      <w:pPr>
-        <w:ind w:left="5040" w:hanging="360"/>
-      </w:pPr>
-      <w:rPr>
-        <w:u w:val="none"/>
-      </w:rPr>
-    </w:lvl>
-    <w:lvl w:ilvl="7">
-      <w:start w:val="1"/>
-      <w:numFmt w:val="lowerLetter"/>
-      <w:lvlText w:val="%8."/>
-      <w:lvlJc w:val="left"/>
-      <w:pPr>
-        <w:ind w:left="5760" w:hanging="360"/>
-      </w:pPr>
-      <w:rPr>
-        <w:u w:val="none"/>
-      </w:rPr>
-    </w:lvl>
-    <w:lvl w:ilvl="8">
-      <w:start w:val="1"/>
-      <w:numFmt w:val="lowerRoman"/>
-      <w:lvlText w:val="%9."/>
-      <w:lvlJc w:val="right"/>
-      <w:pPr>
-        <w:ind w:left="6480" w:hanging="360"/>
-      </w:pPr>
-      <w:rPr>
-        <w:u w:val="none"/>
-      </w:rPr>
-    </w:lvl>
-  </w:abstractNum>
-  <w:abstractNum w:abstractNumId="4">
-    <w:lvl w:ilvl="0">
-      <w:start w:val="1"/>
-      <w:numFmt w:val="bullet"/>
-      <w:lvlText w:val="●"/>
-      <w:lvlJc w:val="left"/>
-      <w:pPr>
-        <w:ind w:left="720" w:hanging="360"/>
-      </w:pPr>
-      <w:rPr>
-        <w:u w:val="none"/>
-      </w:rPr>
-    </w:lvl>
-    <w:lvl w:ilvl="1">
-      <w:start w:val="1"/>
-      <w:numFmt w:val="bullet"/>
-      <w:lvlText w:val="○"/>
-      <w:lvlJc w:val="left"/>
-      <w:pPr>
-        <w:ind w:left="1440" w:hanging="360"/>
-      </w:pPr>
-      <w:rPr>
-        <w:u w:val="none"/>
-      </w:rPr>
-    </w:lvl>
-    <w:lvl w:ilvl="2">
-      <w:start w:val="1"/>
-      <w:numFmt w:val="bullet"/>
-      <w:lvlText w:val="■"/>
-      <w:lvlJc w:val="left"/>
-      <w:pPr>
-        <w:ind w:left="2160" w:hanging="360"/>
-      </w:pPr>
-      <w:rPr>
-        <w:u w:val="none"/>
-      </w:rPr>
-    </w:lvl>
-    <w:lvl w:ilvl="3">
-      <w:start w:val="1"/>
-      <w:numFmt w:val="bullet"/>
-      <w:lvlText w:val="●"/>
-      <w:lvlJc w:val="left"/>
-      <w:pPr>
-        <w:ind w:left="2880" w:hanging="360"/>
-      </w:pPr>
-      <w:rPr>
-        <w:u w:val="none"/>
-      </w:rPr>
-    </w:lvl>
-    <w:lvl w:ilvl="4">
-      <w:start w:val="1"/>
-      <w:numFmt w:val="bullet"/>
-      <w:lvlText w:val="○"/>
-      <w:lvlJc w:val="left"/>
-      <w:pPr>
-        <w:ind w:left="3600" w:hanging="360"/>
-      </w:pPr>
-      <w:rPr>
-        <w:u w:val="none"/>
-      </w:rPr>
-    </w:lvl>
-    <w:lvl w:ilvl="5">
-      <w:start w:val="1"/>
-      <w:numFmt w:val="bullet"/>
-      <w:lvlText w:val="■"/>
-      <w:lvlJc w:val="left"/>
-      <w:pPr>
-        <w:ind w:left="4320" w:hanging="360"/>
-      </w:pPr>
-      <w:rPr>
-        <w:u w:val="none"/>
-      </w:rPr>
-    </w:lvl>
-    <w:lvl w:ilvl="6">
-      <w:start w:val="1"/>
-      <w:numFmt w:val="bullet"/>
-      <w:lvlText w:val="●"/>
-      <w:lvlJc w:val="left"/>
-      <w:pPr>
-        <w:ind w:left="5040" w:hanging="360"/>
-      </w:pPr>
-      <w:rPr>
-        <w:u w:val="none"/>
-      </w:rPr>
-    </w:lvl>
-    <w:lvl w:ilvl="7">
-      <w:start w:val="1"/>
-      <w:numFmt w:val="bullet"/>
-      <w:lvlText w:val="○"/>
-      <w:lvlJc w:val="left"/>
-      <w:pPr>
-        <w:ind w:left="5760" w:hanging="360"/>
-      </w:pPr>
-      <w:rPr>
-        <w:u w:val="none"/>
-      </w:rPr>
-    </w:lvl>
-    <w:lvl w:ilvl="8">
-      <w:start w:val="1"/>
-      <w:numFmt w:val="bullet"/>
-      <w:lvlText w:val="■"/>
-      <w:lvlJc w:val="left"/>
-      <w:pPr>
-        <w:ind w:left="6480" w:hanging="360"/>
-      </w:pPr>
-      <w:rPr>
-        <w:u w:val="none"/>
-      </w:rPr>
-    </w:lvl>
-  </w:abstractNum>
-  <w:abstractNum w:abstractNumId="5">
     <w:lvl w:ilvl="0">
       <w:start w:val="1"/>
       <w:numFmt w:val="bullet"/>
@@ -1860,15 +1367,6 @@
   <w:num w:numId="2">
     <w:abstractNumId w:val="2"/>
   </w:num>
-  <w:num w:numId="3">
-    <w:abstractNumId w:val="3"/>
-  </w:num>
-  <w:num w:numId="4">
-    <w:abstractNumId w:val="4"/>
-  </w:num>
-  <w:num w:numId="5">
-    <w:abstractNumId w:val="5"/>
-  </w:num>
 </w:numbering>
 </file>
 
@@ -1881,7 +1379,7 @@
         <w:color w:val="1f1f1f"/>
         <w:sz w:val="22"/>
         <w:szCs w:val="22"/>
-        <w:lang w:val="en"/>
+        <w:lang w:val="es"/>
       </w:rPr>
     </w:rPrDefault>
     <w:pPrDefault>
@@ -2118,6 +1616,17 @@
     <w:semiHidden w:val="1"/>
     <w:unhideWhenUsed w:val="1"/>
   </w:style>
+  <w:style w:type="table" w:styleId="TableNormal" w:customStyle="1">
+    <w:name w:val="TableNormal"/>
+    <w:tblPr>
+      <w:tblCellMar>
+        <w:top w:w="100.0" w:type="dxa"/>
+        <w:left w:w="100.0" w:type="dxa"/>
+        <w:bottom w:w="100.0" w:type="dxa"/>
+        <w:right w:w="100.0" w:type="dxa"/>
+      </w:tblCellMar>
+    </w:tblPr>
+  </w:style>
   <w:style w:type="paragraph" w:styleId="Encabezado">
     <w:name w:val="header"/>
     <w:basedOn w:val="Normal"/>
@@ -2174,7 +1683,6 @@
   <w:style w:type="character" w:styleId="Ttulo1Car" w:customStyle="1">
     <w:name w:val="Título 1 Car"/>
     <w:basedOn w:val="Fuentedeprrafopredeter"/>
-    <w:link w:val="Ttulo1"/>
     <w:uiPriority w:val="9"/>
     <w:rsid w:val="00FC693F"/>
     <w:rPr>
@@ -2189,7 +1697,6 @@
   <w:style w:type="character" w:styleId="Ttulo2Car" w:customStyle="1">
     <w:name w:val="Título 2 Car"/>
     <w:basedOn w:val="Fuentedeprrafopredeter"/>
-    <w:link w:val="Ttulo2"/>
     <w:uiPriority w:val="9"/>
     <w:rsid w:val="00FC693F"/>
     <w:rPr>
@@ -2204,7 +1711,6 @@
   <w:style w:type="character" w:styleId="Ttulo3Car" w:customStyle="1">
     <w:name w:val="Título 3 Car"/>
     <w:basedOn w:val="Fuentedeprrafopredeter"/>
-    <w:link w:val="Ttulo3"/>
     <w:uiPriority w:val="9"/>
     <w:rsid w:val="00FC693F"/>
     <w:rPr>
@@ -2217,7 +1723,6 @@
   <w:style w:type="character" w:styleId="PuestoCar" w:customStyle="1">
     <w:name w:val="Puesto Car"/>
     <w:basedOn w:val="Fuentedeprrafopredeter"/>
-    <w:link w:val="Puesto"/>
     <w:uiPriority w:val="10"/>
     <w:rsid w:val="00FC693F"/>
     <w:rPr>
@@ -2232,7 +1737,6 @@
   <w:style w:type="character" w:styleId="SubttuloCar" w:customStyle="1">
     <w:name w:val="Subtítulo Car"/>
     <w:basedOn w:val="Fuentedeprrafopredeter"/>
-    <w:link w:val="Subttulo"/>
     <w:uiPriority w:val="11"/>
     <w:rsid w:val="00FC693F"/>
     <w:rPr>
@@ -2423,9 +1927,10 @@
     <w:unhideWhenUsed w:val="1"/>
     <w:rsid w:val="0029639D"/>
     <w:pPr>
-      <w:numPr>
-        <w:numId w:val="7"/>
-      </w:numPr>
+      <w:tabs>
+        <w:tab w:val="num" w:pos="720"/>
+      </w:tabs>
+      <w:ind w:left="720" w:hanging="720"/>
       <w:contextualSpacing w:val="1"/>
     </w:pPr>
   </w:style>
@@ -2529,7 +2034,6 @@
   <w:style w:type="character" w:styleId="Ttulo4Car" w:customStyle="1">
     <w:name w:val="Título 4 Car"/>
     <w:basedOn w:val="Fuentedeprrafopredeter"/>
-    <w:link w:val="Ttulo4"/>
     <w:uiPriority w:val="9"/>
     <w:semiHidden w:val="1"/>
     <w:rsid w:val="00FC693F"/>
@@ -2545,7 +2049,6 @@
   <w:style w:type="character" w:styleId="Ttulo5Car" w:customStyle="1">
     <w:name w:val="Título 5 Car"/>
     <w:basedOn w:val="Fuentedeprrafopredeter"/>
-    <w:link w:val="Ttulo5"/>
     <w:uiPriority w:val="9"/>
     <w:semiHidden w:val="1"/>
     <w:rsid w:val="00FC693F"/>
@@ -2557,7 +2060,6 @@
   <w:style w:type="character" w:styleId="Ttulo6Car" w:customStyle="1">
     <w:name w:val="Título 6 Car"/>
     <w:basedOn w:val="Fuentedeprrafopredeter"/>
-    <w:link w:val="Ttulo6"/>
     <w:uiPriority w:val="9"/>
     <w:semiHidden w:val="1"/>
     <w:rsid w:val="00FC693F"/>
@@ -2759,16 +2261,12 @@
   </w:style>
   <w:style w:type="paragraph" w:styleId="TtulodeTDC">
     <w:name w:val="TOC Heading"/>
-    <w:basedOn w:val="Ttulo1"/>
     <w:next w:val="Normal"/>
     <w:uiPriority w:val="39"/>
     <w:semiHidden w:val="1"/>
     <w:unhideWhenUsed w:val="1"/>
     <w:qFormat w:val="1"/>
     <w:rsid w:val="00FC693F"/>
-    <w:pPr>
-      <w:outlineLvl w:val="9"/>
-    </w:pPr>
   </w:style>
   <w:style w:type="table" w:styleId="Tablaconcuadrcula">
     <w:name w:val="Table Grid"/>
@@ -13517,6 +13015,137 @@
       </w:tcPr>
     </w:tblStylePr>
   </w:style>
+  <w:style w:type="table" w:styleId="a" w:customStyle="1">
+    <w:basedOn w:val="TableNormal"/>
+    <w:tblPr>
+      <w:tblStyleRowBandSize w:val="1"/>
+      <w:tblStyleColBandSize w:val="1"/>
+      <w:tblCellMar>
+        <w:top w:w="0.0" w:type="dxa"/>
+        <w:left w:w="115.0" w:type="dxa"/>
+        <w:bottom w:w="0.0" w:type="dxa"/>
+        <w:right w:w="115.0" w:type="dxa"/>
+      </w:tblCellMar>
+    </w:tblPr>
+  </w:style>
+  <w:style w:type="table" w:styleId="a0" w:customStyle="1">
+    <w:basedOn w:val="TableNormal"/>
+    <w:pPr>
+      <w:spacing w:after="0" w:line="240" w:lineRule="auto"/>
+    </w:pPr>
+    <w:tblPr>
+      <w:tblStyleRowBandSize w:val="1"/>
+      <w:tblStyleColBandSize w:val="1"/>
+      <w:tblCellMar>
+        <w:top w:w="0.0" w:type="dxa"/>
+        <w:left w:w="108.0" w:type="dxa"/>
+        <w:bottom w:w="0.0" w:type="dxa"/>
+        <w:right w:w="108.0" w:type="dxa"/>
+      </w:tblCellMar>
+    </w:tblPr>
+    <w:tblStylePr w:type="firstRow">
+      <w:pPr>
+        <w:spacing w:after="0" w:before="0" w:line="240" w:lineRule="auto"/>
+      </w:pPr>
+      <w:rPr>
+        <w:rFonts w:ascii="Calibri" w:cs="Calibri" w:eastAsia="Calibri" w:hAnsi="Calibri"/>
+        <w:b w:val="1"/>
+        <w:bCs w:val="1"/>
+      </w:rPr>
+      <w:tblPr/>
+      <w:tcPr>
+        <w:tcBorders>
+          <w:top w:color="4f81bd" w:space="0" w:sz="8" w:val="single"/>
+          <w:left w:color="4f81bd" w:space="0" w:sz="8" w:val="single"/>
+          <w:bottom w:color="4f81bd" w:space="0" w:sz="18" w:val="single"/>
+          <w:right w:color="4f81bd" w:space="0" w:sz="8" w:val="single"/>
+          <w:insideH w:space="0" w:sz="0" w:val="nil"/>
+          <w:insideV w:color="4f81bd" w:space="0" w:sz="8" w:val="single"/>
+        </w:tcBorders>
+      </w:tcPr>
+    </w:tblStylePr>
+    <w:tblStylePr w:type="lastRow">
+      <w:pPr>
+        <w:spacing w:after="0" w:before="0" w:line="240" w:lineRule="auto"/>
+      </w:pPr>
+      <w:rPr>
+        <w:rFonts w:ascii="Calibri" w:cs="Calibri" w:eastAsia="Calibri" w:hAnsi="Calibri"/>
+        <w:b w:val="1"/>
+        <w:bCs w:val="1"/>
+      </w:rPr>
+      <w:tblPr/>
+      <w:tcPr>
+        <w:tcBorders>
+          <w:top w:color="4f81bd" w:space="0" w:sz="6" w:val="single"/>
+          <w:left w:color="4f81bd" w:space="0" w:sz="8" w:val="single"/>
+          <w:bottom w:color="4f81bd" w:space="0" w:sz="8" w:val="single"/>
+          <w:right w:color="4f81bd" w:space="0" w:sz="8" w:val="single"/>
+          <w:insideH w:space="0" w:sz="0" w:val="nil"/>
+          <w:insideV w:color="4f81bd" w:space="0" w:sz="8" w:val="single"/>
+        </w:tcBorders>
+      </w:tcPr>
+    </w:tblStylePr>
+    <w:tblStylePr w:type="firstCol">
+      <w:rPr>
+        <w:rFonts w:ascii="Calibri" w:cs="Calibri" w:eastAsia="Calibri" w:hAnsi="Calibri"/>
+        <w:b w:val="1"/>
+        <w:bCs w:val="1"/>
+      </w:rPr>
+    </w:tblStylePr>
+    <w:tblStylePr w:type="lastCol">
+      <w:rPr>
+        <w:rFonts w:ascii="Calibri" w:cs="Calibri" w:eastAsia="Calibri" w:hAnsi="Calibri"/>
+        <w:b w:val="1"/>
+        <w:bCs w:val="1"/>
+      </w:rPr>
+      <w:tblPr/>
+      <w:tcPr>
+        <w:tcBorders>
+          <w:top w:color="4f81bd" w:space="0" w:sz="8" w:val="single"/>
+          <w:left w:color="4f81bd" w:space="0" w:sz="8" w:val="single"/>
+          <w:bottom w:color="4f81bd" w:space="0" w:sz="8" w:val="single"/>
+          <w:right w:color="4f81bd" w:space="0" w:sz="8" w:val="single"/>
+        </w:tcBorders>
+      </w:tcPr>
+    </w:tblStylePr>
+    <w:tblStylePr w:type="band1Vert">
+      <w:tblPr/>
+      <w:tcPr>
+        <w:tcBorders>
+          <w:top w:color="4f81bd" w:space="0" w:sz="8" w:val="single"/>
+          <w:left w:color="4f81bd" w:space="0" w:sz="8" w:val="single"/>
+          <w:bottom w:color="4f81bd" w:space="0" w:sz="8" w:val="single"/>
+          <w:right w:color="4f81bd" w:space="0" w:sz="8" w:val="single"/>
+        </w:tcBorders>
+        <w:shd w:color="auto" w:fill="d3dfee" w:val="clear"/>
+      </w:tcPr>
+    </w:tblStylePr>
+    <w:tblStylePr w:type="band1Horz">
+      <w:tblPr/>
+      <w:tcPr>
+        <w:tcBorders>
+          <w:top w:color="4f81bd" w:space="0" w:sz="8" w:val="single"/>
+          <w:left w:color="4f81bd" w:space="0" w:sz="8" w:val="single"/>
+          <w:bottom w:color="4f81bd" w:space="0" w:sz="8" w:val="single"/>
+          <w:right w:color="4f81bd" w:space="0" w:sz="8" w:val="single"/>
+          <w:insideV w:color="4f81bd" w:space="0" w:sz="8" w:val="single"/>
+        </w:tcBorders>
+        <w:shd w:color="auto" w:fill="d3dfee" w:val="clear"/>
+      </w:tcPr>
+    </w:tblStylePr>
+    <w:tblStylePr w:type="band2Horz">
+      <w:tblPr/>
+      <w:tcPr>
+        <w:tcBorders>
+          <w:top w:color="4f81bd" w:space="0" w:sz="8" w:val="single"/>
+          <w:left w:color="4f81bd" w:space="0" w:sz="8" w:val="single"/>
+          <w:bottom w:color="4f81bd" w:space="0" w:sz="8" w:val="single"/>
+          <w:right w:color="4f81bd" w:space="0" w:sz="8" w:val="single"/>
+          <w:insideV w:color="4f81bd" w:space="0" w:sz="8" w:val="single"/>
+        </w:tcBorders>
+      </w:tcPr>
+    </w:tblStylePr>
+  </w:style>
   <w:style w:type="paragraph" w:styleId="Subtitle">
     <w:name w:val="Subtitle"/>
     <w:basedOn w:val="Normal"/>
@@ -13532,19 +13161,6 @@
     </w:rPr>
   </w:style>
   <w:style w:type="table" w:styleId="Table1">
-    <w:basedOn w:val="TableNormal"/>
-    <w:tblPr>
-      <w:tblStyleRowBandSize w:val="1"/>
-      <w:tblStyleColBandSize w:val="1"/>
-      <w:tblCellMar>
-        <w:top w:w="0.0" w:type="dxa"/>
-        <w:left w:w="115.0" w:type="dxa"/>
-        <w:bottom w:w="0.0" w:type="dxa"/>
-        <w:right w:w="115.0" w:type="dxa"/>
-      </w:tblCellMar>
-    </w:tblPr>
-  </w:style>
-  <w:style w:type="table" w:styleId="Table2">
     <w:basedOn w:val="TableNormal"/>
     <w:pPr>
       <w:spacing w:after="0" w:line="240" w:lineRule="auto"/>
@@ -13981,7 +13597,7 @@
 
 <file path=customXML/item1.xml><?xml version="1.0" encoding="utf-8"?>
 <go:gDocsCustomXmlDataStorage xmlns:go="http://customooxmlschemas.google.com/" xmlns:r="http://schemas.openxmlformats.org/officeDocument/2006/relationships" uri="GoogleDocsCustomDataVersion2">
-  <go:docsCustomData xmlns:go="http://customooxmlschemas.google.com/" roundtripDataSignature="AMtx7mgDvp8Qtr7KItoQr6H1c2tPHLibdQ==">CgMxLjAaHQoBMBIYChYIB0ISEhBBcmlhbCBVbmljb2RlIE1TMg5oLmsxanh6MWtkZjR0ZjIOaC4yZnQxajRwaWw2N2k4AHIhMWV6SzFFMXJndVRpalJ2Um1nR0hyQk5JUmtaOENvT28x</go:docsCustomData>
+  <go:docsCustomData xmlns:go="http://customooxmlschemas.google.com/" roundtripDataSignature="AMtx7mizU43WdZanOoKSJ1hX6jwoEbCaOQ==">CgMxLjAyDmgueDB5NnN5dnV0bDJrMg5oLmsxanh6MWtkZjR0ZjgAciExRVlSSEhtY2EzTHk3aG5SOV9nN2ZqNDlzQlU0YW1Qbmw=</go:docsCustomData>
 </go:gDocsCustomXmlDataStorage>
 </file>
 

</xml_diff>